<commit_message>
Regenerate Simplified OA subfiles
</commit_message>
<xml_diff>
--- a/Project Rooms/Operating Agreements/sources/Jeff Watson/Simplified OA Subfiles/07 - Article 5 - Managers.docx
+++ b/Project Rooms/Operating Agreements/sources/Jeff Watson/Simplified OA Subfiles/07 - Article 5 - Managers.docx
@@ -191,6 +191,15 @@
           <w:color w:val="0070C0"/>
         </w:rPr>
         <w:t xml:space="preserve"> replaced, resigns, or is removed. Attending a meeting or approving its minutes counts as accepting the Manager role.</w:t>
+      </w:r>
+    </w:p>
+    <w:p>
+      <w:r>
+        <w:rPr>
+          <w:b w:val="0"/>
+          <w:color w:val="008000"/>
+        </w:rPr>
+        <w:t>Current Manager(s). Joshua Kennedy is the current Manager of the Company and will serve until replaced, resignation, or removal under this Agreement.</w:t>
       </w:r>
     </w:p>
     <w:p>

</xml_diff>